<commit_message>
feat: production-ready improvements (100% complete)
</commit_message>
<xml_diff>
--- a/Технический_отчет_Nanoprobe_Sim_Lab_2026.docx
+++ b/Технический_отчет_Nanoprobe_Sim_Lab_2026.docx
@@ -76,7 +76,6 @@
           <w:iCs/>
           <w:sz w:val="24"/>
           <w:szCs w:val="24"/>
-          <w:lang w:val="en-US"/>
         </w:rPr>
       </w:pPr>
       <w:r>
@@ -414,13 +413,7 @@
         </w:r>
       </w:hyperlink>
     </w:p>
-    <w:p>
-      <w:pPr>
-        <w:rPr>
-          <w:lang w:val="en-US"/>
-        </w:rPr>
-      </w:pPr>
-    </w:p>
+    <w:p/>
     <w:p>
       <w:pPr>
         <w:spacing w:before="480"/>
@@ -486,13 +479,7 @@
         <w:t>Отчет 45 с., 5 табл., 25 источников.</w:t>
       </w:r>
     </w:p>
-    <w:p>
-      <w:pPr>
-        <w:rPr>
-          <w:lang w:val="en-US"/>
-        </w:rPr>
-      </w:pPr>
-    </w:p>
+    <w:p/>
     <w:p>
       <w:pPr>
         <w:ind w:firstLine="709"/>
@@ -521,9 +508,6 @@
         <w:ind w:firstLine="709"/>
         <w:jc w:val="both"/>
       </w:pPr>
-      <w:r>
-        <w:t>Цель работы — систематизация и сравнительный анализ существующих подходов к моделированию СЗМ, методов обработки изображений поверхности и протоколов передачи данных SSTV, а также разработка методических рекомендаций для создания комплексного научно-образовательного проекта.</w:t>
-      </w:r>
     </w:p>
     <w:p>
       <w:pPr>
@@ -531,15 +515,14 @@
         <w:jc w:val="both"/>
       </w:pPr>
       <w:r>
-        <w:t xml:space="preserve">В результате исследования проведена классификация методов сканирующей зондовой микроскопии, систематизированы алгоритмы обработки AFM-изображений, проанализированы протоколы SSTV для приема радиосигналов. Разработаны практические примеры реализации модулей на языках C++ и Python с использованием </w:t>
-      </w:r>
-      <w:proofErr w:type="spellStart"/>
-      <w:r>
-        <w:t>FastAPI</w:t>
-      </w:r>
-      <w:proofErr w:type="spellEnd"/>
-      <w:r>
-        <w:t xml:space="preserve"> REST API.</w:t>
+        <w:rPr>
+          <w:b/>
+          <w:bCs/>
+        </w:rPr>
+        <w:t>Цель работы</w:t>
+      </w:r>
+      <w:r>
+        <w:t xml:space="preserve"> — систематизация и сравнительный анализ существующих подходов к моделированию СЗМ, методов обработки изображений поверхности и протоколов передачи данных SSTV, а также разработка методических рекомендаций для создания комплексного научно-образовательного проекта.</w:t>
       </w:r>
     </w:p>
     <w:p>
@@ -547,8 +530,44 @@
         <w:ind w:firstLine="709"/>
         <w:jc w:val="both"/>
       </w:pPr>
-      <w:r>
-        <w:t>Область применения: научно-исследовательские работы в области нанотехнологий, образовательные проекты по материаловедению, разработка программного обеспечения для сканирующей зондовой микроскопии.</w:t>
+    </w:p>
+    <w:p>
+      <w:pPr>
+        <w:ind w:firstLine="709"/>
+        <w:jc w:val="both"/>
+      </w:pPr>
+      <w:r>
+        <w:t xml:space="preserve">В результате исследования проведена классификация методов сканирующей зондовой микроскопии, систематизированы алгоритмы обработки AFM-изображений, проанализированы протоколы SSTV для приема радиосигналов. Разработаны практические примеры реализации модулей на языках C++ и Python с использованием </w:t>
+      </w:r>
+      <w:proofErr w:type="spellStart"/>
+      <w:r>
+        <w:t>FastAPI</w:t>
+      </w:r>
+      <w:proofErr w:type="spellEnd"/>
+      <w:r>
+        <w:t xml:space="preserve"> REST API.</w:t>
+      </w:r>
+    </w:p>
+    <w:p>
+      <w:pPr>
+        <w:ind w:firstLine="709"/>
+        <w:jc w:val="both"/>
+      </w:pPr>
+    </w:p>
+    <w:p>
+      <w:pPr>
+        <w:ind w:firstLine="709"/>
+        <w:jc w:val="both"/>
+      </w:pPr>
+      <w:r>
+        <w:rPr>
+          <w:b/>
+          <w:bCs/>
+        </w:rPr>
+        <w:t>Область применения:</w:t>
+      </w:r>
+      <w:r>
+        <w:t xml:space="preserve"> научно-исследовательские работы в области нанотехнологий, образовательные проекты по материаловедению, разработка программного обеспечения для сканирующей зондовой микроскопии.</w:t>
       </w:r>
     </w:p>
     <w:p>
@@ -959,7 +978,14 @@
         <w:jc w:val="both"/>
       </w:pPr>
       <w:r>
-        <w:t xml:space="preserve">AFM — Atomic Force </w:t>
+        <w:rPr>
+          <w:b/>
+          <w:bCs/>
+        </w:rPr>
+        <w:t xml:space="preserve">AFM </w:t>
+      </w:r>
+      <w:r>
+        <w:t xml:space="preserve">— Atomic Force </w:t>
       </w:r>
       <w:proofErr w:type="spellStart"/>
       <w:r>
@@ -976,7 +1002,14 @@
         <w:jc w:val="both"/>
       </w:pPr>
       <w:r>
-        <w:t xml:space="preserve">STM — </w:t>
+        <w:rPr>
+          <w:b/>
+          <w:bCs/>
+        </w:rPr>
+        <w:t>STM</w:t>
+      </w:r>
+      <w:r>
+        <w:t xml:space="preserve"> — </w:t>
       </w:r>
       <w:proofErr w:type="spellStart"/>
       <w:r>
@@ -1009,7 +1042,14 @@
         <w:jc w:val="both"/>
       </w:pPr>
       <w:r>
-        <w:t>СЗМ — сканирующая зондовая микроскопия</w:t>
+        <w:rPr>
+          <w:b/>
+          <w:bCs/>
+        </w:rPr>
+        <w:t xml:space="preserve">СЗМ </w:t>
+      </w:r>
+      <w:r>
+        <w:t>— сканирующая зондовая микроскопия</w:t>
       </w:r>
     </w:p>
     <w:p>
@@ -1018,7 +1058,14 @@
         <w:jc w:val="both"/>
       </w:pPr>
       <w:r>
-        <w:t xml:space="preserve">NSOM — </w:t>
+        <w:rPr>
+          <w:b/>
+          <w:bCs/>
+        </w:rPr>
+        <w:t>NSOM</w:t>
+      </w:r>
+      <w:r>
+        <w:t xml:space="preserve"> — </w:t>
       </w:r>
       <w:proofErr w:type="spellStart"/>
       <w:r>
@@ -1059,7 +1106,14 @@
         <w:jc w:val="both"/>
       </w:pPr>
       <w:r>
-        <w:t xml:space="preserve">SSTV — </w:t>
+        <w:rPr>
+          <w:b/>
+          <w:bCs/>
+        </w:rPr>
+        <w:t xml:space="preserve">SSTV </w:t>
+      </w:r>
+      <w:r>
+        <w:t xml:space="preserve">— </w:t>
       </w:r>
       <w:proofErr w:type="spellStart"/>
       <w:r>
@@ -1084,7 +1138,14 @@
         <w:jc w:val="both"/>
       </w:pPr>
       <w:r>
-        <w:t xml:space="preserve">API — Application </w:t>
+        <w:rPr>
+          <w:b/>
+          <w:bCs/>
+        </w:rPr>
+        <w:t>API</w:t>
+      </w:r>
+      <w:r>
+        <w:t xml:space="preserve"> — Application </w:t>
       </w:r>
       <w:proofErr w:type="spellStart"/>
       <w:r>
@@ -1101,7 +1162,14 @@
         <w:jc w:val="both"/>
       </w:pPr>
       <w:r>
-        <w:t xml:space="preserve">JWT — JSON Web </w:t>
+        <w:rPr>
+          <w:b/>
+          <w:bCs/>
+        </w:rPr>
+        <w:t xml:space="preserve">JWT </w:t>
+      </w:r>
+      <w:r>
+        <w:t xml:space="preserve">— JSON Web </w:t>
       </w:r>
       <w:proofErr w:type="spellStart"/>
       <w:r>
@@ -1118,7 +1186,14 @@
         <w:jc w:val="both"/>
       </w:pPr>
       <w:r>
-        <w:t xml:space="preserve">FFT — Fast </w:t>
+        <w:rPr>
+          <w:b/>
+          <w:bCs/>
+        </w:rPr>
+        <w:t xml:space="preserve">FFT </w:t>
+      </w:r>
+      <w:r>
+        <w:t xml:space="preserve">— Fast </w:t>
       </w:r>
       <w:proofErr w:type="spellStart"/>
       <w:r>
@@ -1147,9 +1222,17 @@
       </w:pPr>
       <w:r>
         <w:rPr>
-          <w:lang w:val="en-US"/>
-        </w:rPr>
-        <w:t>FM — Frequency Modulation (</w:t>
+          <w:b/>
+          <w:bCs/>
+          <w:lang w:val="en-US"/>
+        </w:rPr>
+        <w:t xml:space="preserve">FM </w:t>
+      </w:r>
+      <w:r>
+        <w:rPr>
+          <w:lang w:val="en-US"/>
+        </w:rPr>
+        <w:t>— Frequency Modulation (</w:t>
       </w:r>
       <w:r>
         <w:t>частотная</w:t>
@@ -1180,9 +1263,17 @@
       </w:pPr>
       <w:r>
         <w:rPr>
-          <w:lang w:val="en-US"/>
-        </w:rPr>
-        <w:t>PID — Proportional-Integral-Derivative (</w:t>
+          <w:b/>
+          <w:bCs/>
+          <w:lang w:val="en-US"/>
+        </w:rPr>
+        <w:t xml:space="preserve">PID </w:t>
+      </w:r>
+      <w:r>
+        <w:rPr>
+          <w:lang w:val="en-US"/>
+        </w:rPr>
+        <w:t>— Proportional-Integral-Derivative (</w:t>
       </w:r>
       <w:r>
         <w:t>пропорционально</w:t>
@@ -1234,7 +1325,13 @@
         <w:br w:type="page"/>
       </w:r>
     </w:p>
-    <w:p/>
+    <w:p>
+      <w:pPr>
+        <w:rPr>
+          <w:lang w:val="en-US"/>
+        </w:rPr>
+      </w:pPr>
+    </w:p>
     <w:p>
       <w:pPr>
         <w:spacing w:after="360"/>
@@ -1256,7 +1353,7 @@
         <w:jc w:val="both"/>
       </w:pPr>
       <w:r>
-        <w:t>Современные нанотехнологии требуют точных методов исследования поверхности материалов на атомарном уровне. Сканирующая зондовая микроскопия (СЗМ) представляет собой семейство методов, позволяющих получать изображения поверхности с нанометровым разрешением. Эффективное использование этих методов требует систематизированного подхода к моделированию, обработке данных и интеграции различных модулей в единые программные комплексы.</w:t>
+        <w:t xml:space="preserve">Современные нанотехнологии требуют точных методов исследования поверхности материалов на атомарном уровне. Сканирующая зондовая микроскопия (СЗМ) представляет собой семейство методов, позволяющих получать изображения поверхности с нанометровым разрешением. </w:t>
       </w:r>
     </w:p>
     <w:p>
@@ -1265,31 +1362,7 @@
         <w:jc w:val="both"/>
       </w:pPr>
       <w:r>
-        <w:t xml:space="preserve">Настоящий отчет подготовлен в рамках разработки комплексного научно-образовательного проекта «Лаборатория моделирования </w:t>
-      </w:r>
-      <w:proofErr w:type="spellStart"/>
-      <w:r>
-        <w:t>нанозонда</w:t>
-      </w:r>
-      <w:proofErr w:type="spellEnd"/>
-      <w:r>
-        <w:t>» (</w:t>
-      </w:r>
-      <w:proofErr w:type="spellStart"/>
-      <w:r>
-        <w:t>Nanoprobe</w:t>
-      </w:r>
-      <w:proofErr w:type="spellEnd"/>
-      <w:r>
-        <w:t xml:space="preserve"> </w:t>
-      </w:r>
-      <w:proofErr w:type="spellStart"/>
-      <w:r>
-        <w:t>Simulation</w:t>
-      </w:r>
-      <w:proofErr w:type="spellEnd"/>
-      <w:r>
-        <w:t xml:space="preserve"> Lab) и ставит целью решение следующих задач: систематизация методов сканирующей зондовой микроскопии и их математических моделей; анализ алгоритмов обработки AFM-изображений; исследование протоколов SSTV для приема радиосигналов; разработка архитектуры программного комплекса с REST API.</w:t>
+        <w:t>Эффективное использование этих методов требует систематизированного подхода к моделированию, обработке данных и интеграции различных модулей в единые программные комплексы.</w:t>
       </w:r>
     </w:p>
     <w:p>
@@ -1297,9 +1370,6 @@
         <w:ind w:firstLine="709"/>
         <w:jc w:val="both"/>
       </w:pPr>
-      <w:r>
-        <w:t>Актуальность работы обусловлена необходимостью создания интегрированной среды для моделирования СЗМ, которая объединяет симуляцию аппаратного обеспечения, обработку экспериментальных данных и коммуникационные модули. Такой комплекс позволяет проводить виртуальные эксперименты, обучать специалистов и разрабатывать новые методики исследования.</w:t>
-      </w:r>
     </w:p>
     <w:p>
       <w:pPr>
@@ -1307,6 +1377,60 @@
         <w:jc w:val="both"/>
       </w:pPr>
       <w:r>
+        <w:t xml:space="preserve">Настоящий отчет подготовлен в рамках разработки комплексного научно-образовательного проекта «Лаборатория моделирования </w:t>
+      </w:r>
+      <w:proofErr w:type="spellStart"/>
+      <w:r>
+        <w:t>нанозонда</w:t>
+      </w:r>
+      <w:proofErr w:type="spellEnd"/>
+      <w:r>
+        <w:t>» (</w:t>
+      </w:r>
+      <w:proofErr w:type="spellStart"/>
+      <w:r>
+        <w:t>Nanoprobe</w:t>
+      </w:r>
+      <w:proofErr w:type="spellEnd"/>
+      <w:r>
+        <w:t xml:space="preserve"> </w:t>
+      </w:r>
+      <w:proofErr w:type="spellStart"/>
+      <w:r>
+        <w:t>Simulation</w:t>
+      </w:r>
+      <w:proofErr w:type="spellEnd"/>
+      <w:r>
+        <w:t xml:space="preserve"> Lab) и ставит целью решение следующих задач: систематизация методов сканирующей зондовой микроскопии и их математических моделей; анализ алгоритмов обработки AFM-изображений; исследование протоколов SSTV для приема радиосигналов; разработка архитектуры программного комплекса с REST API.</w:t>
+      </w:r>
+    </w:p>
+    <w:p>
+      <w:pPr>
+        <w:ind w:firstLine="709"/>
+        <w:jc w:val="both"/>
+      </w:pPr>
+    </w:p>
+    <w:p>
+      <w:pPr>
+        <w:ind w:firstLine="709"/>
+        <w:jc w:val="both"/>
+      </w:pPr>
+      <w:r>
+        <w:t>Актуальность работы обусловлена необходимостью создания интегрированной среды для моделирования СЗМ, которая объединяет симуляцию аппаратного обеспечения, обработку экспериментальных данных и коммуникационные модули. Такой комплекс позволяет проводить виртуальные эксперименты, обучать специалистов и разрабатывать новые методики исследования.</w:t>
+      </w:r>
+    </w:p>
+    <w:p>
+      <w:pPr>
+        <w:ind w:firstLine="709"/>
+        <w:jc w:val="both"/>
+      </w:pPr>
+    </w:p>
+    <w:p>
+      <w:pPr>
+        <w:ind w:firstLine="709"/>
+        <w:jc w:val="both"/>
+      </w:pPr>
+      <w:r>
         <w:t xml:space="preserve">Методологической основой послужил анализ научной литературы по сканирующей зондовой микроскопии, технической документации по протоколам SSTV, а также практическая реализация модулей на языках C++ и Python с использованием фреймворка </w:t>
       </w:r>
       <w:proofErr w:type="spellStart"/>
@@ -1317,8 +1441,6 @@
       <w:r>
         <w:t>.</w:t>
       </w:r>
-    </w:p>
-    <w:p>
       <w:r>
         <w:br w:type="page"/>
       </w:r>
@@ -1422,12 +1544,6 @@
         <w:gridCol w:w="1955"/>
       </w:tblGrid>
       <w:tr>
-        <w:tblPrEx>
-          <w:tblCellMar>
-            <w:top w:w="0" w:type="dxa"/>
-            <w:bottom w:w="0" w:type="dxa"/>
-          </w:tblCellMar>
-        </w:tblPrEx>
         <w:trPr>
           <w:tblHeader/>
         </w:trPr>
@@ -1569,12 +1685,6 @@
         </w:tc>
       </w:tr>
       <w:tr>
-        <w:tblPrEx>
-          <w:tblCellMar>
-            <w:top w:w="0" w:type="dxa"/>
-            <w:bottom w:w="0" w:type="dxa"/>
-          </w:tblCellMar>
-        </w:tblPrEx>
         <w:tc>
           <w:tcPr>
             <w:tcW w:w="2400" w:type="dxa"/>
@@ -1701,12 +1811,6 @@
         </w:tc>
       </w:tr>
       <w:tr>
-        <w:tblPrEx>
-          <w:tblCellMar>
-            <w:top w:w="0" w:type="dxa"/>
-            <w:bottom w:w="0" w:type="dxa"/>
-          </w:tblCellMar>
-        </w:tblPrEx>
         <w:tc>
           <w:tcPr>
             <w:tcW w:w="2400" w:type="dxa"/>
@@ -1833,12 +1937,6 @@
         </w:tc>
       </w:tr>
       <w:tr>
-        <w:tblPrEx>
-          <w:tblCellMar>
-            <w:top w:w="0" w:type="dxa"/>
-            <w:bottom w:w="0" w:type="dxa"/>
-          </w:tblCellMar>
-        </w:tblPrEx>
         <w:tc>
           <w:tcPr>
             <w:tcW w:w="2400" w:type="dxa"/>
@@ -2167,13 +2265,7 @@
         <w:t>, а также конфигурации с освещением через зонд и сбором света через объектив. Каждая конфигурация имеет свои преимущества для конкретных приложений.</w:t>
       </w:r>
     </w:p>
-    <w:p>
-      <w:pPr>
-        <w:rPr>
-          <w:lang w:val="en-US"/>
-        </w:rPr>
-      </w:pPr>
-    </w:p>
+    <w:p/>
     <w:p>
       <w:pPr>
         <w:spacing w:before="240" w:after="120"/>
@@ -2214,12 +2306,6 @@
         <w:gridCol w:w="1954"/>
       </w:tblGrid>
       <w:tr>
-        <w:tblPrEx>
-          <w:tblCellMar>
-            <w:top w:w="0" w:type="dxa"/>
-            <w:bottom w:w="0" w:type="dxa"/>
-          </w:tblCellMar>
-        </w:tblPrEx>
         <w:trPr>
           <w:tblHeader/>
         </w:trPr>
@@ -2395,12 +2481,6 @@
         </w:tc>
       </w:tr>
       <w:tr>
-        <w:tblPrEx>
-          <w:tblCellMar>
-            <w:top w:w="0" w:type="dxa"/>
-            <w:bottom w:w="0" w:type="dxa"/>
-          </w:tblCellMar>
-        </w:tblPrEx>
         <w:tc>
           <w:tcPr>
             <w:tcW w:w="1600" w:type="dxa"/>
@@ -2558,12 +2638,6 @@
         </w:tc>
       </w:tr>
       <w:tr>
-        <w:tblPrEx>
-          <w:tblCellMar>
-            <w:top w:w="0" w:type="dxa"/>
-            <w:bottom w:w="0" w:type="dxa"/>
-          </w:tblCellMar>
-        </w:tblPrEx>
         <w:tc>
           <w:tcPr>
             <w:tcW w:w="1600" w:type="dxa"/>
@@ -2721,12 +2795,6 @@
         </w:tc>
       </w:tr>
       <w:tr>
-        <w:tblPrEx>
-          <w:tblCellMar>
-            <w:top w:w="0" w:type="dxa"/>
-            <w:bottom w:w="0" w:type="dxa"/>
-          </w:tblCellMar>
-        </w:tblPrEx>
         <w:tc>
           <w:tcPr>
             <w:tcW w:w="1600" w:type="dxa"/>
@@ -2953,21 +3021,12 @@
       <w:pPr>
         <w:ind w:firstLine="709"/>
         <w:jc w:val="both"/>
-        <w:rPr>
-          <w:lang w:val="en-US"/>
-        </w:rPr>
       </w:pPr>
       <w:r>
         <w:t>Основные типы шумов в AFM-изображениях включают: высокочастотный шум от электронных компонентов, низкочастотный дрейф от термических эффектов, полосовой шум от несовершенства сканирующего механизма, а также импульсные помехи. Каждый тип требует применения специализированных алгоритмов фильтрации.</w:t>
       </w:r>
     </w:p>
-    <w:p>
-      <w:pPr>
-        <w:rPr>
-          <w:lang w:val="en-US"/>
-        </w:rPr>
-      </w:pPr>
-    </w:p>
+    <w:p/>
     <w:p>
       <w:pPr>
         <w:spacing w:before="240" w:after="120"/>
@@ -3007,12 +3066,6 @@
         <w:gridCol w:w="2355"/>
       </w:tblGrid>
       <w:tr>
-        <w:tblPrEx>
-          <w:tblCellMar>
-            <w:top w:w="0" w:type="dxa"/>
-            <w:bottom w:w="0" w:type="dxa"/>
-          </w:tblCellMar>
-        </w:tblPrEx>
         <w:trPr>
           <w:tblHeader/>
         </w:trPr>
@@ -3154,12 +3207,6 @@
         </w:tc>
       </w:tr>
       <w:tr>
-        <w:tblPrEx>
-          <w:tblCellMar>
-            <w:top w:w="0" w:type="dxa"/>
-            <w:bottom w:w="0" w:type="dxa"/>
-          </w:tblCellMar>
-        </w:tblPrEx>
         <w:tc>
           <w:tcPr>
             <w:tcW w:w="2200" w:type="dxa"/>
@@ -3286,12 +3333,6 @@
         </w:tc>
       </w:tr>
       <w:tr>
-        <w:tblPrEx>
-          <w:tblCellMar>
-            <w:top w:w="0" w:type="dxa"/>
-            <w:bottom w:w="0" w:type="dxa"/>
-          </w:tblCellMar>
-        </w:tblPrEx>
         <w:tc>
           <w:tcPr>
             <w:tcW w:w="2200" w:type="dxa"/>
@@ -3418,12 +3459,6 @@
         </w:tc>
       </w:tr>
       <w:tr>
-        <w:tblPrEx>
-          <w:tblCellMar>
-            <w:top w:w="0" w:type="dxa"/>
-            <w:bottom w:w="0" w:type="dxa"/>
-          </w:tblCellMar>
-        </w:tblPrEx>
         <w:tc>
           <w:tcPr>
             <w:tcW w:w="2200" w:type="dxa"/>
@@ -3550,12 +3585,6 @@
         </w:tc>
       </w:tr>
       <w:tr>
-        <w:tblPrEx>
-          <w:tblCellMar>
-            <w:top w:w="0" w:type="dxa"/>
-            <w:bottom w:w="0" w:type="dxa"/>
-          </w:tblCellMar>
-        </w:tblPrEx>
         <w:tc>
           <w:tcPr>
             <w:tcW w:w="2200" w:type="dxa"/>
@@ -3866,12 +3895,6 @@
         <w:gridCol w:w="2548"/>
       </w:tblGrid>
       <w:tr>
-        <w:tblPrEx>
-          <w:tblCellMar>
-            <w:top w:w="0" w:type="dxa"/>
-            <w:bottom w:w="0" w:type="dxa"/>
-          </w:tblCellMar>
-        </w:tblPrEx>
         <w:trPr>
           <w:tblHeader/>
         </w:trPr>
@@ -4013,12 +4036,6 @@
         </w:tc>
       </w:tr>
       <w:tr>
-        <w:tblPrEx>
-          <w:tblCellMar>
-            <w:top w:w="0" w:type="dxa"/>
-            <w:bottom w:w="0" w:type="dxa"/>
-          </w:tblCellMar>
-        </w:tblPrEx>
         <w:tc>
           <w:tcPr>
             <w:tcW w:w="1400" w:type="dxa"/>
@@ -4147,12 +4164,6 @@
         </w:tc>
       </w:tr>
       <w:tr>
-        <w:tblPrEx>
-          <w:tblCellMar>
-            <w:top w:w="0" w:type="dxa"/>
-            <w:bottom w:w="0" w:type="dxa"/>
-          </w:tblCellMar>
-        </w:tblPrEx>
         <w:tc>
           <w:tcPr>
             <w:tcW w:w="1400" w:type="dxa"/>
@@ -4281,12 +4292,6 @@
         </w:tc>
       </w:tr>
       <w:tr>
-        <w:tblPrEx>
-          <w:tblCellMar>
-            <w:top w:w="0" w:type="dxa"/>
-            <w:bottom w:w="0" w:type="dxa"/>
-          </w:tblCellMar>
-        </w:tblPrEx>
         <w:tc>
           <w:tcPr>
             <w:tcW w:w="1400" w:type="dxa"/>
@@ -4415,12 +4420,6 @@
         </w:tc>
       </w:tr>
       <w:tr>
-        <w:tblPrEx>
-          <w:tblCellMar>
-            <w:top w:w="0" w:type="dxa"/>
-            <w:bottom w:w="0" w:type="dxa"/>
-          </w:tblCellMar>
-        </w:tblPrEx>
         <w:tc>
           <w:tcPr>
             <w:tcW w:w="1400" w:type="dxa"/>
@@ -4558,12 +4557,6 @@
         </w:tc>
       </w:tr>
       <w:tr>
-        <w:tblPrEx>
-          <w:tblCellMar>
-            <w:top w:w="0" w:type="dxa"/>
-            <w:bottom w:w="0" w:type="dxa"/>
-          </w:tblCellMar>
-        </w:tblPrEx>
         <w:tc>
           <w:tcPr>
             <w:tcW w:w="1400" w:type="dxa"/>
@@ -4830,12 +4823,6 @@
         <w:gridCol w:w="2147"/>
       </w:tblGrid>
       <w:tr>
-        <w:tblPrEx>
-          <w:tblCellMar>
-            <w:top w:w="0" w:type="dxa"/>
-            <w:bottom w:w="0" w:type="dxa"/>
-          </w:tblCellMar>
-        </w:tblPrEx>
         <w:trPr>
           <w:tblHeader/>
         </w:trPr>
@@ -5011,12 +4998,6 @@
         </w:tc>
       </w:tr>
       <w:tr>
-        <w:tblPrEx>
-          <w:tblCellMar>
-            <w:top w:w="0" w:type="dxa"/>
-            <w:bottom w:w="0" w:type="dxa"/>
-          </w:tblCellMar>
-        </w:tblPrEx>
         <w:tc>
           <w:tcPr>
             <w:tcW w:w="1800" w:type="dxa"/>
@@ -5174,12 +5155,6 @@
         </w:tc>
       </w:tr>
       <w:tr>
-        <w:tblPrEx>
-          <w:tblCellMar>
-            <w:top w:w="0" w:type="dxa"/>
-            <w:bottom w:w="0" w:type="dxa"/>
-          </w:tblCellMar>
-        </w:tblPrEx>
         <w:tc>
           <w:tcPr>
             <w:tcW w:w="1800" w:type="dxa"/>
@@ -5346,12 +5321,6 @@
         </w:tc>
       </w:tr>
       <w:tr>
-        <w:tblPrEx>
-          <w:tblCellMar>
-            <w:top w:w="0" w:type="dxa"/>
-            <w:bottom w:w="0" w:type="dxa"/>
-          </w:tblCellMar>
-        </w:tblPrEx>
         <w:tc>
           <w:tcPr>
             <w:tcW w:w="1800" w:type="dxa"/>
@@ -5509,12 +5478,6 @@
         </w:tc>
       </w:tr>
       <w:tr>
-        <w:tblPrEx>
-          <w:tblCellMar>
-            <w:top w:w="0" w:type="dxa"/>
-            <w:bottom w:w="0" w:type="dxa"/>
-          </w:tblCellMar>
-        </w:tblPrEx>
         <w:tc>
           <w:tcPr>
             <w:tcW w:w="1800" w:type="dxa"/>
@@ -5878,6 +5841,9 @@
     <w:p>
       <w:pPr>
         <w:shd w:val="clear" w:color="auto" w:fill="F5F5F5"/>
+        <w:rPr>
+          <w:lang w:val="en-US"/>
+        </w:rPr>
       </w:pPr>
       <w:r>
         <w:rPr>
@@ -5887,212 +5853,204 @@
         </w:rPr>
         <w:t xml:space="preserve">    </w:t>
       </w:r>
-      <w:proofErr w:type="spellStart"/>
       <w:r>
         <w:rPr>
           <w:rFonts w:ascii="Courier New" w:eastAsia="Courier New" w:hAnsi="Courier New" w:cs="Courier New"/>
           <w:sz w:val="20"/>
           <w:szCs w:val="20"/>
-        </w:rPr>
-        <w:t>double</w:t>
-      </w:r>
-      <w:proofErr w:type="spellEnd"/>
+          <w:lang w:val="en-US"/>
+        </w:rPr>
+        <w:t xml:space="preserve">double </w:t>
+      </w:r>
+      <w:proofErr w:type="spellStart"/>
       <w:r>
         <w:rPr>
           <w:rFonts w:ascii="Courier New" w:eastAsia="Courier New" w:hAnsi="Courier New" w:cs="Courier New"/>
           <w:sz w:val="20"/>
           <w:szCs w:val="20"/>
-        </w:rPr>
-        <w:t xml:space="preserve"> </w:t>
-      </w:r>
-      <w:proofErr w:type="spellStart"/>
+          <w:lang w:val="en-US"/>
+        </w:rPr>
+        <w:t>spring_constant</w:t>
+      </w:r>
+      <w:proofErr w:type="spellEnd"/>
       <w:r>
         <w:rPr>
           <w:rFonts w:ascii="Courier New" w:eastAsia="Courier New" w:hAnsi="Courier New" w:cs="Courier New"/>
           <w:sz w:val="20"/>
           <w:szCs w:val="20"/>
-        </w:rPr>
-        <w:t>spring_</w:t>
-      </w:r>
-      <w:proofErr w:type="gramStart"/>
+          <w:lang w:val="en-US"/>
+        </w:rPr>
+        <w:t xml:space="preserve">;  // </w:t>
+      </w:r>
       <w:r>
         <w:rPr>
           <w:rFonts w:ascii="Courier New" w:eastAsia="Courier New" w:hAnsi="Courier New" w:cs="Courier New"/>
           <w:sz w:val="20"/>
           <w:szCs w:val="20"/>
         </w:rPr>
-        <w:t>constant</w:t>
-      </w:r>
-      <w:proofErr w:type="spellEnd"/>
+        <w:t>Жесткость</w:t>
+      </w:r>
       <w:r>
         <w:rPr>
           <w:rFonts w:ascii="Courier New" w:eastAsia="Courier New" w:hAnsi="Courier New" w:cs="Courier New"/>
           <w:sz w:val="20"/>
           <w:szCs w:val="20"/>
-        </w:rPr>
-        <w:t>;  /</w:t>
-      </w:r>
-      <w:proofErr w:type="gramEnd"/>
+          <w:lang w:val="en-US"/>
+        </w:rPr>
+        <w:t xml:space="preserve"> (</w:t>
+      </w:r>
       <w:r>
         <w:rPr>
           <w:rFonts w:ascii="Courier New" w:eastAsia="Courier New" w:hAnsi="Courier New" w:cs="Courier New"/>
           <w:sz w:val="20"/>
           <w:szCs w:val="20"/>
         </w:rPr>
-        <w:t>/ Жесткость (Н/м)</w:t>
-      </w:r>
-    </w:p>
-    <w:p>
-      <w:pPr>
-        <w:shd w:val="clear" w:color="auto" w:fill="F5F5F5"/>
-      </w:pPr>
+        <w:t>Н</w:t>
+      </w:r>
       <w:r>
         <w:rPr>
           <w:rFonts w:ascii="Courier New" w:eastAsia="Courier New" w:hAnsi="Courier New" w:cs="Courier New"/>
           <w:sz w:val="20"/>
           <w:szCs w:val="20"/>
-        </w:rPr>
-        <w:t xml:space="preserve">    </w:t>
-      </w:r>
-      <w:proofErr w:type="spellStart"/>
+          <w:lang w:val="en-US"/>
+        </w:rPr>
+        <w:t>/</w:t>
+      </w:r>
       <w:r>
         <w:rPr>
           <w:rFonts w:ascii="Courier New" w:eastAsia="Courier New" w:hAnsi="Courier New" w:cs="Courier New"/>
           <w:sz w:val="20"/>
           <w:szCs w:val="20"/>
         </w:rPr>
-        <w:t>double</w:t>
-      </w:r>
-      <w:proofErr w:type="spellEnd"/>
+        <w:t>м</w:t>
+      </w:r>
       <w:r>
         <w:rPr>
           <w:rFonts w:ascii="Courier New" w:eastAsia="Courier New" w:hAnsi="Courier New" w:cs="Courier New"/>
           <w:sz w:val="20"/>
           <w:szCs w:val="20"/>
-        </w:rPr>
-        <w:t xml:space="preserve"> </w:t>
-      </w:r>
-      <w:proofErr w:type="spellStart"/>
-      <w:proofErr w:type="gramStart"/>
+          <w:lang w:val="en-US"/>
+        </w:rPr>
+        <w:t>)</w:t>
+      </w:r>
+    </w:p>
+    <w:p>
+      <w:pPr>
+        <w:shd w:val="clear" w:color="auto" w:fill="F5F5F5"/>
+        <w:rPr>
+          <w:lang w:val="en-US"/>
+        </w:rPr>
+      </w:pPr>
       <w:r>
         <w:rPr>
           <w:rFonts w:ascii="Courier New" w:eastAsia="Courier New" w:hAnsi="Courier New" w:cs="Courier New"/>
           <w:sz w:val="20"/>
           <w:szCs w:val="20"/>
-        </w:rPr>
-        <w:t>damping</w:t>
-      </w:r>
-      <w:proofErr w:type="spellEnd"/>
+          <w:lang w:val="en-US"/>
+        </w:rPr>
+        <w:t xml:space="preserve">    double damping;         // </w:t>
+      </w:r>
       <w:r>
         <w:rPr>
           <w:rFonts w:ascii="Courier New" w:eastAsia="Courier New" w:hAnsi="Courier New" w:cs="Courier New"/>
           <w:sz w:val="20"/>
           <w:szCs w:val="20"/>
         </w:rPr>
-        <w:t xml:space="preserve">;   </w:t>
-      </w:r>
-      <w:proofErr w:type="gramEnd"/>
+        <w:t>Демпфирование</w:t>
+      </w:r>
+    </w:p>
+    <w:p>
+      <w:pPr>
+        <w:shd w:val="clear" w:color="auto" w:fill="F5F5F5"/>
+        <w:rPr>
+          <w:lang w:val="en-US"/>
+        </w:rPr>
+      </w:pPr>
       <w:r>
         <w:rPr>
           <w:rFonts w:ascii="Courier New" w:eastAsia="Courier New" w:hAnsi="Courier New" w:cs="Courier New"/>
           <w:sz w:val="20"/>
           <w:szCs w:val="20"/>
-        </w:rPr>
-        <w:t xml:space="preserve">      // Демпфирование</w:t>
-      </w:r>
-    </w:p>
-    <w:p>
-      <w:pPr>
-        <w:shd w:val="clear" w:color="auto" w:fill="F5F5F5"/>
-      </w:pPr>
+          <w:lang w:val="en-US"/>
+        </w:rPr>
+        <w:t xml:space="preserve">    double </w:t>
+      </w:r>
+      <w:proofErr w:type="spellStart"/>
       <w:r>
         <w:rPr>
           <w:rFonts w:ascii="Courier New" w:eastAsia="Courier New" w:hAnsi="Courier New" w:cs="Courier New"/>
           <w:sz w:val="20"/>
           <w:szCs w:val="20"/>
-        </w:rPr>
-        <w:t xml:space="preserve">    </w:t>
-      </w:r>
-      <w:proofErr w:type="spellStart"/>
+          <w:lang w:val="en-US"/>
+        </w:rPr>
+        <w:t>resonance_freq</w:t>
+      </w:r>
+      <w:proofErr w:type="spellEnd"/>
       <w:r>
         <w:rPr>
           <w:rFonts w:ascii="Courier New" w:eastAsia="Courier New" w:hAnsi="Courier New" w:cs="Courier New"/>
           <w:sz w:val="20"/>
           <w:szCs w:val="20"/>
-        </w:rPr>
-        <w:t>double</w:t>
-      </w:r>
-      <w:proofErr w:type="spellEnd"/>
+          <w:lang w:val="en-US"/>
+        </w:rPr>
+        <w:t xml:space="preserve">;  // </w:t>
+      </w:r>
       <w:r>
         <w:rPr>
           <w:rFonts w:ascii="Courier New" w:eastAsia="Courier New" w:hAnsi="Courier New" w:cs="Courier New"/>
           <w:sz w:val="20"/>
           <w:szCs w:val="20"/>
         </w:rPr>
-        <w:t xml:space="preserve"> </w:t>
-      </w:r>
-      <w:proofErr w:type="spellStart"/>
+        <w:t>Резонансная</w:t>
+      </w:r>
       <w:r>
         <w:rPr>
           <w:rFonts w:ascii="Courier New" w:eastAsia="Courier New" w:hAnsi="Courier New" w:cs="Courier New"/>
           <w:sz w:val="20"/>
           <w:szCs w:val="20"/>
-        </w:rPr>
-        <w:t>resonance_</w:t>
-      </w:r>
-      <w:proofErr w:type="gramStart"/>
+          <w:lang w:val="en-US"/>
+        </w:rPr>
+        <w:t xml:space="preserve"> </w:t>
+      </w:r>
       <w:r>
         <w:rPr>
           <w:rFonts w:ascii="Courier New" w:eastAsia="Courier New" w:hAnsi="Courier New" w:cs="Courier New"/>
           <w:sz w:val="20"/>
           <w:szCs w:val="20"/>
         </w:rPr>
-        <w:t>freq</w:t>
-      </w:r>
-      <w:proofErr w:type="spellEnd"/>
+        <w:t>частота</w:t>
+      </w:r>
+    </w:p>
+    <w:p>
+      <w:pPr>
+        <w:shd w:val="clear" w:color="auto" w:fill="F5F5F5"/>
+        <w:rPr>
+          <w:lang w:val="en-US"/>
+        </w:rPr>
+      </w:pPr>
       <w:r>
         <w:rPr>
           <w:rFonts w:ascii="Courier New" w:eastAsia="Courier New" w:hAnsi="Courier New" w:cs="Courier New"/>
           <w:sz w:val="20"/>
           <w:szCs w:val="20"/>
-        </w:rPr>
-        <w:t>;  /</w:t>
-      </w:r>
-      <w:proofErr w:type="gramEnd"/>
+          <w:lang w:val="en-US"/>
+        </w:rPr>
+        <w:t xml:space="preserve">    </w:t>
+      </w:r>
+    </w:p>
+    <w:p>
+      <w:pPr>
+        <w:shd w:val="clear" w:color="auto" w:fill="F5F5F5"/>
+        <w:rPr>
+          <w:lang w:val="fr-FR"/>
+        </w:rPr>
+      </w:pPr>
       <w:r>
         <w:rPr>
           <w:rFonts w:ascii="Courier New" w:eastAsia="Courier New" w:hAnsi="Courier New" w:cs="Courier New"/>
           <w:sz w:val="20"/>
           <w:szCs w:val="20"/>
-        </w:rPr>
-        <w:t>/ Резонансная частота</w:t>
-      </w:r>
-    </w:p>
-    <w:p>
-      <w:pPr>
-        <w:shd w:val="clear" w:color="auto" w:fill="F5F5F5"/>
-      </w:pPr>
-      <w:r>
-        <w:rPr>
-          <w:rFonts w:ascii="Courier New" w:eastAsia="Courier New" w:hAnsi="Courier New" w:cs="Courier New"/>
-          <w:sz w:val="20"/>
-          <w:szCs w:val="20"/>
-        </w:rPr>
-        <w:t xml:space="preserve">    </w:t>
-      </w:r>
-    </w:p>
-    <w:p>
-      <w:pPr>
-        <w:shd w:val="clear" w:color="auto" w:fill="F5F5F5"/>
-        <w:rPr>
-          <w:lang w:val="fr-FR"/>
-        </w:rPr>
-      </w:pPr>
-      <w:r>
-        <w:rPr>
-          <w:rFonts w:ascii="Courier New" w:eastAsia="Courier New" w:hAnsi="Courier New" w:cs="Courier New"/>
-          <w:sz w:val="20"/>
-          <w:szCs w:val="20"/>
+          <w:lang w:val="en-US"/>
         </w:rPr>
         <w:t xml:space="preserve">    </w:t>
       </w:r>
@@ -6400,9 +6358,9 @@
           <w:szCs w:val="20"/>
           <w:lang w:val="en-US"/>
         </w:rPr>
-        <w:t>calculate_</w:t>
-      </w:r>
-      <w:proofErr w:type="gramStart"/>
+        <w:t>calculate_roughness</w:t>
+      </w:r>
+      <w:proofErr w:type="spellEnd"/>
       <w:r>
         <w:rPr>
           <w:rFonts w:ascii="Courier New" w:eastAsia="Courier New" w:hAnsi="Courier New" w:cs="Courier New"/>
@@ -6410,27 +6368,7 @@
           <w:szCs w:val="20"/>
           <w:lang w:val="en-US"/>
         </w:rPr>
-        <w:t>roughness</w:t>
-      </w:r>
-      <w:proofErr w:type="spellEnd"/>
-      <w:r>
-        <w:rPr>
-          <w:rFonts w:ascii="Courier New" w:eastAsia="Courier New" w:hAnsi="Courier New" w:cs="Courier New"/>
-          <w:sz w:val="20"/>
-          <w:szCs w:val="20"/>
-          <w:lang w:val="en-US"/>
-        </w:rPr>
-        <w:t>(</w:t>
-      </w:r>
-      <w:proofErr w:type="gramEnd"/>
-      <w:r>
-        <w:rPr>
-          <w:rFonts w:ascii="Courier New" w:eastAsia="Courier New" w:hAnsi="Courier New" w:cs="Courier New"/>
-          <w:sz w:val="20"/>
-          <w:szCs w:val="20"/>
-          <w:lang w:val="en-US"/>
-        </w:rPr>
-        <w:t xml:space="preserve">surface: </w:t>
+        <w:t xml:space="preserve">(surface: </w:t>
       </w:r>
       <w:proofErr w:type="spellStart"/>
       <w:r>
@@ -6505,7 +6443,6 @@
         <w:t xml:space="preserve">Sq = </w:t>
       </w:r>
       <w:proofErr w:type="spellStart"/>
-      <w:proofErr w:type="gramStart"/>
       <w:r>
         <w:rPr>
           <w:rFonts w:ascii="Courier New" w:eastAsia="Courier New" w:hAnsi="Courier New" w:cs="Courier New"/>
@@ -6516,7 +6453,6 @@
         <w:t>np.sqrt</w:t>
       </w:r>
       <w:proofErr w:type="spellEnd"/>
-      <w:proofErr w:type="gramEnd"/>
       <w:r>
         <w:rPr>
           <w:rFonts w:ascii="Courier New" w:eastAsia="Courier New" w:hAnsi="Courier New" w:cs="Courier New"/>
@@ -6565,7 +6501,13 @@
         <w:t xml:space="preserve">    return {'Sa': Sa, 'Sq': Sq}</w:t>
       </w:r>
     </w:p>
-    <w:p/>
+    <w:p>
+      <w:pPr>
+        <w:rPr>
+          <w:lang w:val="en-US"/>
+        </w:rPr>
+      </w:pPr>
+    </w:p>
     <w:p>
       <w:pPr>
         <w:pStyle w:val="2"/>
@@ -6830,7 +6772,6 @@
         <w:t xml:space="preserve">from </w:t>
       </w:r>
       <w:proofErr w:type="spellStart"/>
-      <w:proofErr w:type="gramStart"/>
       <w:r>
         <w:rPr>
           <w:rFonts w:ascii="Courier New" w:eastAsia="Courier New" w:hAnsi="Courier New" w:cs="Courier New"/>
@@ -6841,7 +6782,6 @@
         <w:t>fastapi.security</w:t>
       </w:r>
       <w:proofErr w:type="spellEnd"/>
-      <w:proofErr w:type="gramEnd"/>
       <w:r>
         <w:rPr>
           <w:rFonts w:ascii="Courier New" w:eastAsia="Courier New" w:hAnsi="Courier New" w:cs="Courier New"/>
@@ -6886,7 +6826,6 @@
         <w:t xml:space="preserve">app = </w:t>
       </w:r>
       <w:proofErr w:type="spellStart"/>
-      <w:proofErr w:type="gramStart"/>
       <w:r>
         <w:rPr>
           <w:rFonts w:ascii="Courier New" w:eastAsia="Courier New" w:hAnsi="Courier New" w:cs="Courier New"/>
@@ -6904,9 +6843,16 @@
           <w:szCs w:val="20"/>
           <w:lang w:val="en-US"/>
         </w:rPr>
-        <w:t>(</w:t>
-      </w:r>
-      <w:proofErr w:type="gramEnd"/>
+        <w:t>(title="Nanoprobe Sim Lab API")</w:t>
+      </w:r>
+    </w:p>
+    <w:p>
+      <w:pPr>
+        <w:shd w:val="clear" w:color="auto" w:fill="F5F5F5"/>
+        <w:rPr>
+          <w:lang w:val="en-US"/>
+        </w:rPr>
+      </w:pPr>
       <w:r>
         <w:rPr>
           <w:rFonts w:ascii="Courier New" w:eastAsia="Courier New" w:hAnsi="Courier New" w:cs="Courier New"/>
@@ -6914,16 +6860,9 @@
           <w:szCs w:val="20"/>
           <w:lang w:val="en-US"/>
         </w:rPr>
-        <w:t>title="Nanoprobe Sim Lab API")</w:t>
-      </w:r>
-    </w:p>
-    <w:p>
-      <w:pPr>
-        <w:shd w:val="clear" w:color="auto" w:fill="F5F5F5"/>
-        <w:rPr>
-          <w:lang w:val="en-US"/>
-        </w:rPr>
-      </w:pPr>
+        <w:t>oauth2_scheme = OAuth2PasswordBearer(</w:t>
+      </w:r>
+      <w:proofErr w:type="spellStart"/>
       <w:r>
         <w:rPr>
           <w:rFonts w:ascii="Courier New" w:eastAsia="Courier New" w:hAnsi="Courier New" w:cs="Courier New"/>
@@ -6931,9 +6870,9 @@
           <w:szCs w:val="20"/>
           <w:lang w:val="en-US"/>
         </w:rPr>
-        <w:t>oauth2_scheme = OAuth2PasswordBearer(</w:t>
-      </w:r>
-      <w:proofErr w:type="spellStart"/>
+        <w:t>tokenUrl</w:t>
+      </w:r>
+      <w:proofErr w:type="spellEnd"/>
       <w:r>
         <w:rPr>
           <w:rFonts w:ascii="Courier New" w:eastAsia="Courier New" w:hAnsi="Courier New" w:cs="Courier New"/>
@@ -6941,9 +6880,16 @@
           <w:szCs w:val="20"/>
           <w:lang w:val="en-US"/>
         </w:rPr>
-        <w:t>tokenUrl</w:t>
-      </w:r>
-      <w:proofErr w:type="spellEnd"/>
+        <w:t>="token")</w:t>
+      </w:r>
+    </w:p>
+    <w:p>
+      <w:pPr>
+        <w:shd w:val="clear" w:color="auto" w:fill="F5F5F5"/>
+        <w:rPr>
+          <w:lang w:val="en-US"/>
+        </w:rPr>
+      </w:pPr>
       <w:r>
         <w:rPr>
           <w:rFonts w:ascii="Courier New" w:eastAsia="Courier New" w:hAnsi="Courier New" w:cs="Courier New"/>
@@ -6951,7 +6897,7 @@
           <w:szCs w:val="20"/>
           <w:lang w:val="en-US"/>
         </w:rPr>
-        <w:t>="token")</w:t>
+        <w:t xml:space="preserve"> </w:t>
       </w:r>
     </w:p>
     <w:p>
@@ -6968,12 +6914,13 @@
           <w:szCs w:val="20"/>
           <w:lang w:val="en-US"/>
         </w:rPr>
-        <w:t xml:space="preserve"> </w:t>
+        <w:t>@app.websocket("/ws/scan")</w:t>
       </w:r>
     </w:p>
     <w:p>
       <w:pPr>
         <w:shd w:val="clear" w:color="auto" w:fill="F5F5F5"/>
+        <w:spacing w:after="120"/>
         <w:rPr>
           <w:lang w:val="en-US"/>
         </w:rPr>
@@ -6985,9 +6932,9 @@
           <w:szCs w:val="20"/>
           <w:lang w:val="en-US"/>
         </w:rPr>
-        <w:t>@</w:t>
-      </w:r>
-      <w:proofErr w:type="gramStart"/>
+        <w:t xml:space="preserve">async def </w:t>
+      </w:r>
+      <w:proofErr w:type="spellStart"/>
       <w:r>
         <w:rPr>
           <w:rFonts w:ascii="Courier New" w:eastAsia="Courier New" w:hAnsi="Courier New" w:cs="Courier New"/>
@@ -6995,9 +6942,9 @@
           <w:szCs w:val="20"/>
           <w:lang w:val="en-US"/>
         </w:rPr>
-        <w:t>app.websocket</w:t>
-      </w:r>
-      <w:proofErr w:type="gramEnd"/>
+        <w:t>scan_stream</w:t>
+      </w:r>
+      <w:proofErr w:type="spellEnd"/>
       <w:r>
         <w:rPr>
           <w:rFonts w:ascii="Courier New" w:eastAsia="Courier New" w:hAnsi="Courier New" w:cs="Courier New"/>
@@ -7005,58 +6952,9 @@
           <w:szCs w:val="20"/>
           <w:lang w:val="en-US"/>
         </w:rPr>
-        <w:t>("/ws/scan")</w:t>
-      </w:r>
-    </w:p>
-    <w:p>
-      <w:pPr>
-        <w:shd w:val="clear" w:color="auto" w:fill="F5F5F5"/>
-        <w:spacing w:after="120"/>
-        <w:rPr>
-          <w:lang w:val="en-US"/>
-        </w:rPr>
-      </w:pPr>
-      <w:r>
-        <w:rPr>
-          <w:rFonts w:ascii="Courier New" w:eastAsia="Courier New" w:hAnsi="Courier New" w:cs="Courier New"/>
-          <w:sz w:val="20"/>
-          <w:szCs w:val="20"/>
-          <w:lang w:val="en-US"/>
-        </w:rPr>
-        <w:t xml:space="preserve">async def </w:t>
-      </w:r>
-      <w:proofErr w:type="spellStart"/>
-      <w:r>
-        <w:rPr>
-          <w:rFonts w:ascii="Courier New" w:eastAsia="Courier New" w:hAnsi="Courier New" w:cs="Courier New"/>
-          <w:sz w:val="20"/>
-          <w:szCs w:val="20"/>
-          <w:lang w:val="en-US"/>
-        </w:rPr>
-        <w:t>scan_</w:t>
-      </w:r>
-      <w:proofErr w:type="gramStart"/>
-      <w:r>
-        <w:rPr>
-          <w:rFonts w:ascii="Courier New" w:eastAsia="Courier New" w:hAnsi="Courier New" w:cs="Courier New"/>
-          <w:sz w:val="20"/>
-          <w:szCs w:val="20"/>
-          <w:lang w:val="en-US"/>
-        </w:rPr>
-        <w:t>stream</w:t>
-      </w:r>
-      <w:proofErr w:type="spellEnd"/>
-      <w:r>
-        <w:rPr>
-          <w:rFonts w:ascii="Courier New" w:eastAsia="Courier New" w:hAnsi="Courier New" w:cs="Courier New"/>
-          <w:sz w:val="20"/>
-          <w:szCs w:val="20"/>
-          <w:lang w:val="en-US"/>
-        </w:rPr>
         <w:t>(</w:t>
       </w:r>
       <w:proofErr w:type="spellStart"/>
-      <w:proofErr w:type="gramEnd"/>
       <w:r>
         <w:rPr>
           <w:rFonts w:ascii="Courier New" w:eastAsia="Courier New" w:hAnsi="Courier New" w:cs="Courier New"/>
@@ -7136,12 +7034,6 @@
         <w:gridCol w:w="2082"/>
       </w:tblGrid>
       <w:tr>
-        <w:tblPrEx>
-          <w:tblCellMar>
-            <w:top w:w="0" w:type="dxa"/>
-            <w:bottom w:w="0" w:type="dxa"/>
-          </w:tblCellMar>
-        </w:tblPrEx>
         <w:trPr>
           <w:tblHeader/>
         </w:trPr>
@@ -7285,12 +7177,6 @@
         </w:tc>
       </w:tr>
       <w:tr>
-        <w:tblPrEx>
-          <w:tblCellMar>
-            <w:top w:w="0" w:type="dxa"/>
-            <w:bottom w:w="0" w:type="dxa"/>
-          </w:tblCellMar>
-        </w:tblPrEx>
         <w:tc>
           <w:tcPr>
             <w:tcW w:w="2800" w:type="dxa"/>
@@ -7442,12 +7328,6 @@
         </w:tc>
       </w:tr>
       <w:tr>
-        <w:tblPrEx>
-          <w:tblCellMar>
-            <w:top w:w="0" w:type="dxa"/>
-            <w:bottom w:w="0" w:type="dxa"/>
-          </w:tblCellMar>
-        </w:tblPrEx>
         <w:tc>
           <w:tcPr>
             <w:tcW w:w="2800" w:type="dxa"/>
@@ -7599,12 +7479,6 @@
         </w:tc>
       </w:tr>
       <w:tr>
-        <w:tblPrEx>
-          <w:tblCellMar>
-            <w:top w:w="0" w:type="dxa"/>
-            <w:bottom w:w="0" w:type="dxa"/>
-          </w:tblCellMar>
-        </w:tblPrEx>
         <w:tc>
           <w:tcPr>
             <w:tcW w:w="2800" w:type="dxa"/>
@@ -7772,12 +7646,6 @@
         </w:tc>
       </w:tr>
       <w:tr>
-        <w:tblPrEx>
-          <w:tblCellMar>
-            <w:top w:w="0" w:type="dxa"/>
-            <w:bottom w:w="0" w:type="dxa"/>
-          </w:tblCellMar>
-        </w:tblPrEx>
         <w:tc>
           <w:tcPr>
             <w:tcW w:w="2800" w:type="dxa"/>
@@ -7931,12 +7799,6 @@
         </w:tc>
       </w:tr>
       <w:tr>
-        <w:tblPrEx>
-          <w:tblCellMar>
-            <w:top w:w="0" w:type="dxa"/>
-            <w:bottom w:w="0" w:type="dxa"/>
-          </w:tblCellMar>
-        </w:tblPrEx>
         <w:tc>
           <w:tcPr>
             <w:tcW w:w="2800" w:type="dxa"/>
@@ -8799,21 +8661,7 @@
         <w:rPr>
           <w:lang w:val="en-US"/>
         </w:rPr>
-        <w:t xml:space="preserve"> H.K. Atomic force microscope—force mapping and profiling on a </w:t>
-      </w:r>
-      <w:proofErr w:type="gramStart"/>
-      <w:r>
-        <w:rPr>
-          <w:lang w:val="en-US"/>
-        </w:rPr>
-        <w:t>sub 100</w:t>
-      </w:r>
-      <w:proofErr w:type="gramEnd"/>
-      <w:r>
-        <w:rPr>
-          <w:lang w:val="en-US"/>
-        </w:rPr>
-        <w:t>-Å scale // Journal of Applied Physics. — 1987. — Vol. 61. — P. 4723-4729.</w:t>
+        <w:t xml:space="preserve"> H.K. Atomic force microscope—force mapping and profiling on a sub 100-Å scale // Journal of Applied Physics. — 1987. — Vol. 61. — P. 4723-4729.</w:t>
       </w:r>
     </w:p>
     <w:p>
@@ -9018,12 +8866,6 @@
         <w:gridCol w:w="1936"/>
       </w:tblGrid>
       <w:tr>
-        <w:tblPrEx>
-          <w:tblCellMar>
-            <w:top w:w="0" w:type="dxa"/>
-            <w:bottom w:w="0" w:type="dxa"/>
-          </w:tblCellMar>
-        </w:tblPrEx>
         <w:trPr>
           <w:tblHeader/>
         </w:trPr>
@@ -9233,12 +9075,6 @@
         </w:tc>
       </w:tr>
       <w:tr>
-        <w:tblPrEx>
-          <w:tblCellMar>
-            <w:top w:w="0" w:type="dxa"/>
-            <w:bottom w:w="0" w:type="dxa"/>
-          </w:tblCellMar>
-        </w:tblPrEx>
         <w:tc>
           <w:tcPr>
             <w:tcW w:w="1200" w:type="dxa"/>
@@ -9427,12 +9263,6 @@
         </w:tc>
       </w:tr>
       <w:tr>
-        <w:tblPrEx>
-          <w:tblCellMar>
-            <w:top w:w="0" w:type="dxa"/>
-            <w:bottom w:w="0" w:type="dxa"/>
-          </w:tblCellMar>
-        </w:tblPrEx>
         <w:tc>
           <w:tcPr>
             <w:tcW w:w="1200" w:type="dxa"/>
@@ -9621,12 +9451,6 @@
         </w:tc>
       </w:tr>
       <w:tr>
-        <w:tblPrEx>
-          <w:tblCellMar>
-            <w:top w:w="0" w:type="dxa"/>
-            <w:bottom w:w="0" w:type="dxa"/>
-          </w:tblCellMar>
-        </w:tblPrEx>
         <w:tc>
           <w:tcPr>
             <w:tcW w:w="1200" w:type="dxa"/>
@@ -9831,12 +9655,6 @@
         </w:tc>
       </w:tr>
       <w:tr>
-        <w:tblPrEx>
-          <w:tblCellMar>
-            <w:top w:w="0" w:type="dxa"/>
-            <w:bottom w:w="0" w:type="dxa"/>
-          </w:tblCellMar>
-        </w:tblPrEx>
         <w:tc>
           <w:tcPr>
             <w:tcW w:w="1200" w:type="dxa"/>
@@ -10025,12 +9843,6 @@
         </w:tc>
       </w:tr>
       <w:tr>
-        <w:tblPrEx>
-          <w:tblCellMar>
-            <w:top w:w="0" w:type="dxa"/>
-            <w:bottom w:w="0" w:type="dxa"/>
-          </w:tblCellMar>
-        </w:tblPrEx>
         <w:tc>
           <w:tcPr>
             <w:tcW w:w="1200" w:type="dxa"/>
@@ -10228,12 +10040,6 @@
         </w:tc>
       </w:tr>
       <w:tr>
-        <w:tblPrEx>
-          <w:tblCellMar>
-            <w:top w:w="0" w:type="dxa"/>
-            <w:bottom w:w="0" w:type="dxa"/>
-          </w:tblCellMar>
-        </w:tblPrEx>
         <w:tc>
           <w:tcPr>
             <w:tcW w:w="1200" w:type="dxa"/>
@@ -10422,12 +10228,6 @@
         </w:tc>
       </w:tr>
       <w:tr>
-        <w:tblPrEx>
-          <w:tblCellMar>
-            <w:top w:w="0" w:type="dxa"/>
-            <w:bottom w:w="0" w:type="dxa"/>
-          </w:tblCellMar>
-        </w:tblPrEx>
         <w:tc>
           <w:tcPr>
             <w:tcW w:w="1200" w:type="dxa"/>
@@ -10616,12 +10416,6 @@
         </w:tc>
       </w:tr>
       <w:tr>
-        <w:tblPrEx>
-          <w:tblCellMar>
-            <w:top w:w="0" w:type="dxa"/>
-            <w:bottom w:w="0" w:type="dxa"/>
-          </w:tblCellMar>
-        </w:tblPrEx>
         <w:tc>
           <w:tcPr>
             <w:tcW w:w="1200" w:type="dxa"/>
@@ -10810,12 +10604,6 @@
         </w:tc>
       </w:tr>
       <w:tr>
-        <w:tblPrEx>
-          <w:tblCellMar>
-            <w:top w:w="0" w:type="dxa"/>
-            <w:bottom w:w="0" w:type="dxa"/>
-          </w:tblCellMar>
-        </w:tblPrEx>
         <w:tc>
           <w:tcPr>
             <w:tcW w:w="1200" w:type="dxa"/>
@@ -11015,12 +10803,6 @@
         </w:tc>
       </w:tr>
       <w:tr>
-        <w:tblPrEx>
-          <w:tblCellMar>
-            <w:top w:w="0" w:type="dxa"/>
-            <w:bottom w:w="0" w:type="dxa"/>
-          </w:tblCellMar>
-        </w:tblPrEx>
         <w:tc>
           <w:tcPr>
             <w:tcW w:w="1200" w:type="dxa"/>
@@ -12314,6 +12096,7 @@
   <w:style w:type="character" w:default="1" w:styleId="a0">
     <w:name w:val="Default Paragraph Font"/>
     <w:uiPriority w:val="1"/>
+    <w:semiHidden/>
     <w:unhideWhenUsed/>
   </w:style>
   <w:style w:type="table" w:default="1" w:styleId="a1">

</xml_diff>